<commit_message>
Metodo de ingeniería y enunciado del juego.
</commit_message>
<xml_diff>
--- a/Docs/Planteamiento del juego.docx
+++ b/Docs/Planteamiento del juego.docx
@@ -19,70 +19,134 @@
           <w:sz w:val="32"/>
           <w:szCs w:val="32"/>
         </w:rPr>
-        <w:t>Planteamiento del juego</w:t>
-      </w:r>
-    </w:p>
-    <w:p/>
-    <w:p>
-      <w:pPr>
-        <w:rPr>
-          <w:b/>
-          <w:bCs/>
-        </w:rPr>
-      </w:pPr>
-      <w:r>
-        <w:rPr>
-          <w:b/>
-          <w:bCs/>
-        </w:rPr>
-        <w:t xml:space="preserve">Reglas y funcionamiento actualizado de </w:t>
-      </w:r>
-      <w:r>
-        <w:rPr>
-          <w:b/>
-          <w:bCs/>
-        </w:rPr>
-        <w:t>“</w:t>
-      </w:r>
-      <w:r>
-        <w:rPr>
-          <w:b/>
-          <w:bCs/>
-        </w:rPr>
-        <w:t>Marlon Escape</w:t>
-      </w:r>
-      <w:r>
-        <w:rPr>
-          <w:b/>
-          <w:bCs/>
-        </w:rPr>
-        <w:t>”</w:t>
-      </w:r>
-    </w:p>
-    <w:p>
-      <w:pPr>
-        <w:rPr>
-          <w:b/>
-          <w:bCs/>
-        </w:rPr>
-      </w:pPr>
-    </w:p>
-    <w:p>
-      <w:pPr>
-        <w:rPr>
-          <w:b/>
-          <w:bCs/>
+        <w:t>Enunciado</w:t>
+      </w:r>
+    </w:p>
+    <w:p>
+      <w:r>
+        <w:t xml:space="preserve">Llega el final del semestre y el ambiente universitario está cargado de estrés. Tú, un estudiante promedio de tercer semestre, te encuentras abrumado por entregas, parciales y la presión de terminar bien. Como si fuera poco, cierto </w:t>
+      </w:r>
+      <w:r>
+        <w:t xml:space="preserve">querido </w:t>
+      </w:r>
+      <w:r>
+        <w:t xml:space="preserve">profesor parece decidido a hacerte </w:t>
+      </w:r>
+      <w:r>
+        <w:t>perder</w:t>
+      </w:r>
+      <w:r>
+        <w:t>.</w:t>
+      </w:r>
+    </w:p>
+    <w:p>
+      <w:r>
+        <w:t>Con toda su energía puesta en hacerte repetir la materia, Marlon recorre el campus buscando atraparte. Tu única opción es escapar antes de que lo logre.</w:t>
+      </w:r>
+    </w:p>
+    <w:p>
+      <w:r>
+        <w:t>El juego te sitúa en el rol del estudiante, en una carrera para escapar del campus universitario antes de ser alcanzado por el profesor y antes de que tu nota final sea insuficiente. Deberás usar toda tu lógica y estrategia para tomar decisiones inteligentes, evitar trampas, aprovechar pistas y alcanzar la salida con la mejor nota posible. Si fallas… prepárate para cursar verano.</w:t>
+      </w:r>
+    </w:p>
+    <w:p>
+      <w:r>
+        <w:rPr>
           <w:i/>
           <w:iCs/>
         </w:rPr>
-      </w:pPr>
-      <w:r>
+        <w:t>“Marlon escape”</w:t>
+      </w:r>
+      <w:r>
+        <w:t xml:space="preserve">, una representación dolorosamente realista </w:t>
+      </w:r>
+      <w:r>
+        <w:t>de lo que se siente sobrevivir a un final de semestre universitario.</w:t>
+      </w:r>
+    </w:p>
+    <w:p/>
+    <w:p>
+      <w:pPr>
+        <w:jc w:val="center"/>
+        <w:rPr>
+          <w:b/>
+          <w:bCs/>
+          <w:sz w:val="32"/>
+          <w:szCs w:val="32"/>
+        </w:rPr>
+      </w:pPr>
+      <w:r>
+        <w:rPr>
+          <w:b/>
+          <w:bCs/>
+          <w:sz w:val="32"/>
+          <w:szCs w:val="32"/>
+        </w:rPr>
+        <w:t>Planteamiento</w:t>
+      </w:r>
+      <w:r>
+        <w:rPr>
+          <w:b/>
+          <w:bCs/>
+          <w:sz w:val="32"/>
+          <w:szCs w:val="32"/>
+        </w:rPr>
+        <w:t xml:space="preserve"> del juego</w:t>
+      </w:r>
+    </w:p>
+    <w:p/>
+    <w:p>
+      <w:pPr>
+        <w:rPr>
+          <w:b/>
+          <w:bCs/>
+        </w:rPr>
+      </w:pPr>
+      <w:r>
+        <w:rPr>
+          <w:b/>
+          <w:bCs/>
+        </w:rPr>
+        <w:t xml:space="preserve">Reglas y funcionamiento actualizado de </w:t>
+      </w:r>
+      <w:r>
+        <w:rPr>
+          <w:b/>
+          <w:bCs/>
+        </w:rPr>
+        <w:t>“</w:t>
+      </w:r>
+      <w:r>
+        <w:rPr>
+          <w:b/>
+          <w:bCs/>
+        </w:rPr>
+        <w:t>Marlon Escape</w:t>
+      </w:r>
+      <w:r>
+        <w:rPr>
+          <w:b/>
+          <w:bCs/>
+        </w:rPr>
+        <w:t>”</w:t>
+      </w:r>
+    </w:p>
+    <w:p>
+      <w:pPr>
         <w:rPr>
           <w:b/>
           <w:bCs/>
           <w:i/>
           <w:iCs/>
         </w:rPr>
+      </w:pPr>
+      <w:r>
+        <w:rPr>
+          <w:b/>
+          <w:bCs/>
+          <w:i/>
+          <w:iCs/>
+        </w:rPr>
         <w:t>Objetivo del juego:</w:t>
       </w:r>
     </w:p>
@@ -103,7 +167,6 @@
         <w:t xml:space="preserve"> campus universitario (representado como un grafo dirigido y ponderado), evitando trampas, tomando pistas y eligiendo rutas inteligentes.</w:t>
       </w:r>
     </w:p>
-    <w:p/>
     <w:p>
       <w:pPr>
         <w:rPr>
@@ -239,6 +302,7 @@
         </w:numPr>
       </w:pPr>
       <w:r>
+        <w:lastRenderedPageBreak/>
         <w:t xml:space="preserve">Para los nodos </w:t>
       </w:r>
       <w:r>
@@ -259,16 +323,7 @@
         <w:t xml:space="preserve">tieneTrampa: boolean </w:t>
       </w:r>
       <w:r>
-        <w:t>-&gt; Indica</w:t>
-      </w:r>
-      <w:r>
-        <w:t xml:space="preserve"> si el nodo tiene una </w:t>
-      </w:r>
-      <w:r>
-        <w:t>trampa</w:t>
-      </w:r>
-      <w:r>
-        <w:t>.</w:t>
+        <w:t>-&gt; Indica si el nodo tiene una trampa.</w:t>
       </w:r>
     </w:p>
     <w:p>
@@ -318,11 +373,6 @@
     </w:p>
     <w:p>
       <w:pPr>
-        <w:ind w:left="720"/>
-      </w:pPr>
-    </w:p>
-    <w:p>
-      <w:pPr>
         <w:rPr>
           <w:b/>
           <w:bCs/>
@@ -345,7 +395,6 @@
         </w:numPr>
       </w:pPr>
       <w:r>
-        <w:lastRenderedPageBreak/>
         <w:t>Antes de iniciar la partida, el sistema asignará 10 trampas y 10 pistas a nodos aleatorios (siguiendo la condición de que si es especial tiene más probabilidad).</w:t>
       </w:r>
     </w:p>
@@ -457,7 +506,6 @@
         <w:t>Las habitaciones con pista no afectan la puntuación.</w:t>
       </w:r>
     </w:p>
-    <w:p/>
     <w:p>
       <w:pPr>
         <w:rPr>
@@ -536,7 +584,6 @@
         <w:t>Si el jugador cae en una habitación con pista, se le muestra el mejor camino hacia la salida (mejor en sentido de menor peso).</w:t>
       </w:r>
     </w:p>
-    <w:p/>
     <w:p>
       <w:pPr>
         <w:rPr>
@@ -558,10 +605,10 @@
           <w:rFonts w:ascii="Consolas" w:hAnsi="Consolas"/>
           <w:sz w:val="22"/>
           <w:szCs w:val="22"/>
-          <w:lang w:val="en-US"/>
-        </w:rPr>
-      </w:pPr>
-      <w:r>
+        </w:rPr>
+      </w:pPr>
+      <w:r>
+        <w:lastRenderedPageBreak/>
         <w:t>Al llegar a la habitación de salida, se calcula la nota así:</w:t>
       </w:r>
     </w:p>
@@ -587,18 +634,16 @@
           <w:rFonts w:ascii="Consolas" w:hAnsi="Consolas"/>
           <w:sz w:val="22"/>
           <w:szCs w:val="22"/>
-          <w:lang w:val="en-US"/>
-        </w:rPr>
-        <w:t>pt</w:t>
+        </w:rPr>
+        <w:t>ptJugador</w:t>
       </w:r>
       <w:r>
         <w:rPr>
           <w:rFonts w:ascii="Consolas" w:hAnsi="Consolas"/>
           <w:sz w:val="22"/>
           <w:szCs w:val="22"/>
-          <w:lang w:val="en-US"/>
-        </w:rPr>
-        <w:t>Jugador</w:t>
+        </w:rPr>
+        <w:t xml:space="preserve"> / </w:t>
       </w:r>
       <w:r>
         <w:rPr>
@@ -606,7 +651,7 @@
           <w:sz w:val="22"/>
           <w:szCs w:val="22"/>
         </w:rPr>
-        <w:t xml:space="preserve"> </w:t>
+        <w:t>ptMax</w:t>
       </w:r>
       <w:r>
         <w:rPr>
@@ -614,27 +659,19 @@
           <w:sz w:val="22"/>
           <w:szCs w:val="22"/>
         </w:rPr>
-        <w:t xml:space="preserve">/ </w:t>
-      </w:r>
-      <w:r>
+        <w:t>;</w:t>
+      </w:r>
+    </w:p>
+    <w:p>
+      <w:pPr>
+        <w:spacing w:after="0"/>
         <w:rPr>
           <w:rFonts w:ascii="Consolas" w:hAnsi="Consolas"/>
           <w:sz w:val="22"/>
           <w:szCs w:val="22"/>
-          <w:lang w:val="en-US"/>
-        </w:rPr>
-        <w:t>ptMax</w:t>
-      </w:r>
-      <w:r>
-        <w:rPr>
-          <w:rFonts w:ascii="Consolas" w:hAnsi="Consolas"/>
-          <w:sz w:val="22"/>
-          <w:szCs w:val="22"/>
-        </w:rPr>
-        <w:t>;</w:t>
-      </w:r>
-    </w:p>
-    <w:p/>
+        </w:rPr>
+      </w:pPr>
+    </w:p>
     <w:p>
       <w:pPr>
         <w:rPr>
@@ -721,7 +758,6 @@
         <w:t>El jugador llega a la habitación de salida, pero su nota final es menor a 3.0.</w:t>
       </w:r>
     </w:p>
-    <w:p/>
     <w:p>
       <w:pPr>
         <w:rPr>
@@ -735,6 +771,21 @@
           <w:bCs/>
         </w:rPr>
         <w:t>Turnos:</w:t>
+      </w:r>
+    </w:p>
+    <w:p>
+      <w:pPr>
+        <w:rPr>
+          <w:b/>
+          <w:bCs/>
+        </w:rPr>
+      </w:pPr>
+      <w:r>
+        <w:rPr>
+          <w:b/>
+          <w:bCs/>
+        </w:rPr>
+        <w:t xml:space="preserve">Importante: El jugador y Marlon inician en una posición aleatoria del mapa. </w:t>
       </w:r>
     </w:p>
     <w:p>
@@ -877,7 +928,13 @@
         </w:numPr>
       </w:pPr>
       <w:r>
-        <w:t>≥ 4.5: “¡Escape perfecto!”</w:t>
+        <w:t>≥ 4.5: “¡Escape perfecto!</w:t>
+      </w:r>
+      <w:r>
+        <w:t xml:space="preserve"> Tu promedio se alzó.</w:t>
+      </w:r>
+      <w:r>
+        <w:t>”</w:t>
       </w:r>
     </w:p>
     <w:p>

</xml_diff>